<commit_message>
Fix errors in grade 9 informatics assessment (KZ and RU versions)
Co-Authored-By: Claude Opus 5.5 <noreply@anthropic.com>
Claude-Session: https://claude.ai/code/session_018n7qTann2QMDviDzenvywj
</commit_message>
<xml_diff>
--- a/out/ТЖБ_9_сынып_информатика_KZ.docx
+++ b/out/ТЖБ_9_сынып_информатика_KZ.docx
@@ -1602,7 +1602,7 @@
           <w:szCs w:val="28"/>
           <w:lang w:val="en-US" w:eastAsia="ru-RU"/>
         </w:rPr>
-        <w:t>‘5’</w:t>
+        <w:t xml:space="preserve">'2'</w:t>
       </w:r>
       <w:r>
         <w:rPr>
@@ -2175,7 +2175,7 @@
           <w:szCs w:val="28"/>
           <w:lang w:val="en-US" w:eastAsia="ru-RU"/>
         </w:rPr>
-        <w:t xml:space="preserve">nums</w:t>
+        <w:t xml:space="preserve">nums = [7, 3, 15, 2, 9]</w:t>
       </w:r>
     </w:p>
     <w:p>
@@ -2545,7 +2545,7 @@
           <w:szCs w:val="28"/>
           <w:lang w:eastAsia="ru-RU"/>
         </w:rPr>
-        <w:t xml:space="preserve"> қамтитын жаңа even_squares тізімін құратын Python бағдарламасын жазыңыз. Алынған тізімнен ең үлкен элементті және оның индексін табыңыз. Соңында бағдарлама алынған тізімді шығаруы тиіс.</w:t>
+        <w:t xml:space="preserve"> қамтитын жаңа even_squares тізімін құратын Python бағдарламасын жазыңыз. Алынған тізімнен ең үлкен элементті және оның индексін табыңыз. Соңында бағдарлама алынған тізімді, ең үлкен элементті және оның индексін шығаруы тиіс.</w:t>
       </w:r>
     </w:p>
     <w:p>
@@ -2567,16 +2567,16 @@
           <w:szCs w:val="28"/>
           <w:lang w:eastAsia="ru-RU"/>
         </w:rPr>
-        <w:t xml:space="preserve">Қорытынды шығыс мысалы:</w:t>
-      </w:r>
-      <w:r>
-        <w:rPr>
-          <w:rFonts w:ascii="Times New Roman" w:eastAsia="Times New Roman" w:hAnsi="Times New Roman" w:cs="Times New Roman"/>
-          <w:sz w:val="28"/>
-          <w:szCs w:val="28"/>
-          <w:lang w:eastAsia="ru-RU"/>
-        </w:rPr>
-        <w:t xml:space="preserve"> [16, 100, 144]</w:t>
+        <w:t xml:space="preserve">Мысал:</w:t>
+      </w:r>
+      <w:r>
+        <w:rPr>
+          <w:rFonts w:ascii="Times New Roman" w:eastAsia="Times New Roman" w:hAnsi="Times New Roman" w:cs="Times New Roman"/>
+          <w:sz w:val="28"/>
+          <w:szCs w:val="28"/>
+          <w:lang w:eastAsia="ru-RU"/>
+        </w:rPr>
+        <w:t xml:space="preserve"> кіріс: [4, 7, 10, 3, 12] → шығыс: [16, 100, 144], ең үлкен элемент: 144, индексі: 2</w:t>
       </w:r>
     </w:p>
     <w:p>
@@ -3162,7 +3162,7 @@
                 <w:szCs w:val="28"/>
                 <w:lang w:eastAsia="ru-RU"/>
               </w:rPr>
-              <w:t xml:space="preserve">(әрбір дұрыс </w:t>
+              <w:t xml:space="preserve">(әрбір 2 дұрыс </w:t>
             </w:r>
             <w:r>
               <w:rPr>
@@ -3173,7 +3173,7 @@
                 <w:szCs w:val="28"/>
                 <w:lang w:val="kk-KZ" w:eastAsia="ru-RU"/>
               </w:rPr>
-              <w:t xml:space="preserve">жауап жұбы </w:t>
+              <w:t xml:space="preserve">жұп </w:t>
             </w:r>
             <w:r>
               <w:rPr>
@@ -3378,7 +3378,7 @@
                 <w:szCs w:val="28"/>
                 <w:lang w:eastAsia="ru-RU"/>
               </w:rPr>
-              <w:t xml:space="preserve">Уақытты есептейді және жауабын жазады.</w:t>
+              <w:t xml:space="preserve">Уақытты есептейді және жауабын жазады (3 с; 1 Мбайт = 1024 Кбайт негізіндегі есептеу де қабылданады).</w:t>
             </w:r>
           </w:p>
         </w:tc>
@@ -4477,7 +4477,7 @@
                 <w:szCs w:val="28"/>
                 <w:lang w:eastAsia="ru-RU"/>
               </w:rPr>
-              <w:t xml:space="preserve">Дұрыс құрама шарттар құрады </w:t>
+              <w:t xml:space="preserve">Шарттарды дұрыс құрады (құрама немесе кірістірілген) </w:t>
             </w:r>
           </w:p>
         </w:tc>

</xml_diff>